<commit_message>
Improve chatbot document ingestion and answer formatting
</commit_message>
<xml_diff>
--- a/documents/training guide.docx
+++ b/documents/training guide.docx
@@ -104,7 +104,27 @@
                 <w:color w:val="404040"/>
                 <w:sz w:val="21"/>
               </w:rPr>
-              <w:t>How to use this file: This document is structurally optimized with definitive Intent Modules, System Target Tags, and crisp Question/Answer patterns. You can directly ingest this into your Retrieval-Augmented Generation (RAG) vector store, semantic search engine, or map them as intents in platforms like Rasa, Dialogflow, or custom LLM context windows.</w:t>
+              <w:t xml:space="preserve">How to use this file: This document is structurally optimized with definitive Intent Modules, System Target Tags, and crisp Question/Answer patterns. You can directly ingest this into your Retrieval-Augmented Generation (RAG) vector store, semantic search engine, or map them as intents in platforms like Rasa, </w:t>
+            </w:r>
+            <w:proofErr w:type="spellStart"/>
+            <w:r>
+              <w:rPr>
+                <w:rFonts w:ascii="Times New Roman" w:hAnsi="Times New Roman" w:cs="Times New Roman"/>
+                <w:i/>
+                <w:color w:val="404040"/>
+                <w:sz w:val="21"/>
+              </w:rPr>
+              <w:t>Dialogflow</w:t>
+            </w:r>
+            <w:proofErr w:type="spellEnd"/>
+            <w:r>
+              <w:rPr>
+                <w:rFonts w:ascii="Times New Roman" w:hAnsi="Times New Roman" w:cs="Times New Roman"/>
+                <w:i/>
+                <w:color w:val="404040"/>
+                <w:sz w:val="21"/>
+              </w:rPr>
+              <w:t>, or custom LLM context windows.</w:t>
             </w:r>
           </w:p>
         </w:tc>
@@ -392,7 +412,25 @@
                 <w:color w:val="333333"/>
                 <w:sz w:val="20"/>
               </w:rPr>
-              <w:t xml:space="preserve">#find_location, #directions, </w:t>
+              <w:t>#</w:t>
+            </w:r>
+            <w:proofErr w:type="gramStart"/>
+            <w:r>
+              <w:rPr>
+                <w:rFonts w:ascii="Times New Roman" w:hAnsi="Times New Roman" w:cs="Times New Roman"/>
+                <w:color w:val="333333"/>
+                <w:sz w:val="20"/>
+              </w:rPr>
+              <w:t>find</w:t>
+            </w:r>
+            <w:proofErr w:type="gramEnd"/>
+            <w:r>
+              <w:rPr>
+                <w:rFonts w:ascii="Times New Roman" w:hAnsi="Times New Roman" w:cs="Times New Roman"/>
+                <w:color w:val="333333"/>
+                <w:sz w:val="20"/>
+              </w:rPr>
+              <w:t xml:space="preserve">_location, #directions, </w:t>
             </w:r>
             <w:r>
               <w:rPr>
@@ -1480,7 +1518,23 @@
           <w:rFonts w:ascii="Times New Roman" w:hAnsi="Times New Roman" w:cs="Times New Roman"/>
           <w:color w:val="333333"/>
         </w:rPr>
-        <w:t>The UDSM Health Centre is situated natively inside the Main Mlimani Campus. It is found directly along the university's primary inner looping ring road, directly opposite the student residential complexes (closely proximate to Hall 3 and Hall 4)</w:t>
+        <w:t xml:space="preserve">The UDSM Health Centre is situated natively inside the Main </w:t>
+      </w:r>
+      <w:proofErr w:type="spellStart"/>
+      <w:r>
+        <w:rPr>
+          <w:rFonts w:ascii="Times New Roman" w:hAnsi="Times New Roman" w:cs="Times New Roman"/>
+          <w:color w:val="333333"/>
+        </w:rPr>
+        <w:t>Mlimani</w:t>
+      </w:r>
+      <w:proofErr w:type="spellEnd"/>
+      <w:r>
+        <w:rPr>
+          <w:rFonts w:ascii="Times New Roman" w:hAnsi="Times New Roman" w:cs="Times New Roman"/>
+          <w:color w:val="333333"/>
+        </w:rPr>
+        <w:t xml:space="preserve"> Campus. It is found directly along the university's primary inner looping ring road, directly opposite the student residential complexes (closely proximate to Hall 3 and Hall 4)</w:t>
       </w:r>
       <w:r>
         <w:rPr>
@@ -1596,13 +1650,29 @@
           <w:rFonts w:ascii="Times New Roman" w:hAnsi="Times New Roman" w:cs="Times New Roman"/>
           <w:color w:val="333333"/>
         </w:rPr>
-        <w:t xml:space="preserve"> stands prominently at the central axis of the Mlimani Main Campus.</w:t>
-      </w:r>
+        <w:t xml:space="preserve"> stands prominently at the central axis of the </w:t>
+      </w:r>
+      <w:proofErr w:type="spellStart"/>
       <w:r>
         <w:rPr>
           <w:rFonts w:ascii="Times New Roman" w:hAnsi="Times New Roman" w:cs="Times New Roman"/>
           <w:color w:val="333333"/>
         </w:rPr>
+        <w:t>Mlimani</w:t>
+      </w:r>
+      <w:proofErr w:type="spellEnd"/>
+      <w:r>
+        <w:rPr>
+          <w:rFonts w:ascii="Times New Roman" w:hAnsi="Times New Roman" w:cs="Times New Roman"/>
+          <w:color w:val="333333"/>
+        </w:rPr>
+        <w:t xml:space="preserve"> Main Campus.</w:t>
+      </w:r>
+      <w:r>
+        <w:rPr>
+          <w:rFonts w:ascii="Times New Roman" w:hAnsi="Times New Roman" w:cs="Times New Roman"/>
+          <w:color w:val="333333"/>
+        </w:rPr>
         <w:t xml:space="preserve"> </w:t>
       </w:r>
       <w:r>
@@ -1626,12 +1696,21 @@
         </w:rPr>
         <w:t xml:space="preserve"> </w:t>
       </w:r>
+      <w:proofErr w:type="spellStart"/>
       <w:r>
         <w:rPr>
           <w:rFonts w:ascii="Times New Roman" w:hAnsi="Times New Roman" w:cs="Times New Roman"/>
           <w:color w:val="333333"/>
         </w:rPr>
-        <w:t>bondeni bus stop.</w:t>
+        <w:t>bondeni</w:t>
+      </w:r>
+      <w:proofErr w:type="spellEnd"/>
+      <w:r>
+        <w:rPr>
+          <w:rFonts w:ascii="Times New Roman" w:hAnsi="Times New Roman" w:cs="Times New Roman"/>
+          <w:color w:val="333333"/>
+        </w:rPr>
+        <w:t xml:space="preserve"> bus stop.</w:t>
       </w:r>
       <w:r>
         <w:rPr>
@@ -1704,20 +1783,44 @@
           <w:rFonts w:ascii="Times New Roman" w:hAnsi="Times New Roman" w:cs="Times New Roman"/>
           <w:color w:val="333333"/>
         </w:rPr>
-        <w:t>Nkrumah Hall is situated inside the Mlimani Main Campus.</w:t>
-      </w:r>
+        <w:t xml:space="preserve">Nkrumah Hall is situated inside the </w:t>
+      </w:r>
+      <w:proofErr w:type="spellStart"/>
       <w:r>
         <w:rPr>
           <w:rFonts w:ascii="Times New Roman" w:hAnsi="Times New Roman" w:cs="Times New Roman"/>
           <w:color w:val="333333"/>
         </w:rPr>
-        <w:t xml:space="preserve"> You can easily access it from the Utaw</w:t>
-      </w:r>
+        <w:t>Mlimani</w:t>
+      </w:r>
+      <w:proofErr w:type="spellEnd"/>
       <w:r>
         <w:rPr>
           <w:rFonts w:ascii="Times New Roman" w:hAnsi="Times New Roman" w:cs="Times New Roman"/>
           <w:color w:val="333333"/>
         </w:rPr>
+        <w:t xml:space="preserve"> Main Campus.</w:t>
+      </w:r>
+      <w:r>
+        <w:rPr>
+          <w:rFonts w:ascii="Times New Roman" w:hAnsi="Times New Roman" w:cs="Times New Roman"/>
+          <w:color w:val="333333"/>
+        </w:rPr>
+        <w:t xml:space="preserve"> You can easily access it from the </w:t>
+      </w:r>
+      <w:proofErr w:type="spellStart"/>
+      <w:r>
+        <w:rPr>
+          <w:rFonts w:ascii="Times New Roman" w:hAnsi="Times New Roman" w:cs="Times New Roman"/>
+          <w:color w:val="333333"/>
+        </w:rPr>
+        <w:t>Utaw</w:t>
+      </w:r>
+      <w:r>
+        <w:rPr>
+          <w:rFonts w:ascii="Times New Roman" w:hAnsi="Times New Roman" w:cs="Times New Roman"/>
+          <w:color w:val="333333"/>
+        </w:rPr>
         <w:t>al</w:t>
       </w:r>
       <w:r>
@@ -1725,7 +1828,15 @@
           <w:rFonts w:ascii="Times New Roman" w:hAnsi="Times New Roman" w:cs="Times New Roman"/>
           <w:color w:val="333333"/>
         </w:rPr>
-        <w:t>a bus stop</w:t>
+        <w:t>a</w:t>
+      </w:r>
+      <w:proofErr w:type="spellEnd"/>
+      <w:r>
+        <w:rPr>
+          <w:rFonts w:ascii="Times New Roman" w:hAnsi="Times New Roman" w:cs="Times New Roman"/>
+          <w:color w:val="333333"/>
+        </w:rPr>
+        <w:t xml:space="preserve"> bus stop</w:t>
       </w:r>
       <w:r>
         <w:rPr>
@@ -1833,15 +1944,49 @@
           <w:rFonts w:ascii="Times New Roman" w:hAnsi="Times New Roman" w:cs="Times New Roman"/>
           <w:color w:val="333333"/>
         </w:rPr>
-        <w:t>CoICT operates distinctively detached from the primary Mlimani boundaries. Its operations are centralized at the Kijitonyama</w:t>
-      </w:r>
+        <w:t xml:space="preserve">CoICT operates distinctively detached from the primary </w:t>
+      </w:r>
+      <w:proofErr w:type="spellStart"/>
       <w:r>
         <w:rPr>
           <w:rFonts w:ascii="Times New Roman" w:hAnsi="Times New Roman" w:cs="Times New Roman"/>
           <w:color w:val="333333"/>
         </w:rPr>
-        <w:t>/Sayansi</w:t>
-      </w:r>
+        <w:t>Mlimani</w:t>
+      </w:r>
+      <w:proofErr w:type="spellEnd"/>
+      <w:r>
+        <w:rPr>
+          <w:rFonts w:ascii="Times New Roman" w:hAnsi="Times New Roman" w:cs="Times New Roman"/>
+          <w:color w:val="333333"/>
+        </w:rPr>
+        <w:t xml:space="preserve"> boundaries. Its operations are centralized at the </w:t>
+      </w:r>
+      <w:proofErr w:type="spellStart"/>
+      <w:r>
+        <w:rPr>
+          <w:rFonts w:ascii="Times New Roman" w:hAnsi="Times New Roman" w:cs="Times New Roman"/>
+          <w:color w:val="333333"/>
+        </w:rPr>
+        <w:t>Kijitonyama</w:t>
+      </w:r>
+      <w:proofErr w:type="spellEnd"/>
+      <w:r>
+        <w:rPr>
+          <w:rFonts w:ascii="Times New Roman" w:hAnsi="Times New Roman" w:cs="Times New Roman"/>
+          <w:color w:val="333333"/>
+        </w:rPr>
+        <w:t>/</w:t>
+      </w:r>
+      <w:proofErr w:type="spellStart"/>
+      <w:r>
+        <w:rPr>
+          <w:rFonts w:ascii="Times New Roman" w:hAnsi="Times New Roman" w:cs="Times New Roman"/>
+          <w:color w:val="333333"/>
+        </w:rPr>
+        <w:t>Sayansi</w:t>
+      </w:r>
+      <w:proofErr w:type="spellEnd"/>
       <w:r>
         <w:rPr>
           <w:rFonts w:ascii="Times New Roman" w:hAnsi="Times New Roman" w:cs="Times New Roman"/>
@@ -1904,7 +2049,25 @@
           <w:b/>
           <w:color w:val="000000"/>
         </w:rPr>
-        <w:t>Where is the College of Engineering and Technology (CoET)?</w:t>
+        <w:t>Where is the College of Engineering and Technology (</w:t>
+      </w:r>
+      <w:proofErr w:type="spellStart"/>
+      <w:r>
+        <w:rPr>
+          <w:rFonts w:ascii="Times New Roman" w:hAnsi="Times New Roman" w:cs="Times New Roman"/>
+          <w:b/>
+          <w:color w:val="000000"/>
+        </w:rPr>
+        <w:t>CoET</w:t>
+      </w:r>
+      <w:proofErr w:type="spellEnd"/>
+      <w:r>
+        <w:rPr>
+          <w:rFonts w:ascii="Times New Roman" w:hAnsi="Times New Roman" w:cs="Times New Roman"/>
+          <w:b/>
+          <w:color w:val="000000"/>
+        </w:rPr>
+        <w:t>)?</w:t>
       </w:r>
     </w:p>
     <w:p>
@@ -1922,12 +2085,37 @@
         </w:rPr>
         <w:t xml:space="preserve">A: </w:t>
       </w:r>
+      <w:proofErr w:type="spellStart"/>
       <w:r>
         <w:rPr>
           <w:rFonts w:ascii="Times New Roman" w:hAnsi="Times New Roman" w:cs="Times New Roman"/>
           <w:color w:val="333333"/>
         </w:rPr>
-        <w:t>CoET is fully situated inside the primary Mlimani Main Campus boundaries. The college maps out as a dedicated multi-block engineering campus quadrant on the western side of the campus grounds, easily reached by executing a right-turn vector immediately following the main university perimeter entrance gate.</w:t>
+        <w:t>CoET</w:t>
+      </w:r>
+      <w:proofErr w:type="spellEnd"/>
+      <w:r>
+        <w:rPr>
+          <w:rFonts w:ascii="Times New Roman" w:hAnsi="Times New Roman" w:cs="Times New Roman"/>
+          <w:color w:val="333333"/>
+        </w:rPr>
+        <w:t xml:space="preserve"> is fully situated inside the primary </w:t>
+      </w:r>
+      <w:proofErr w:type="spellStart"/>
+      <w:r>
+        <w:rPr>
+          <w:rFonts w:ascii="Times New Roman" w:hAnsi="Times New Roman" w:cs="Times New Roman"/>
+          <w:color w:val="333333"/>
+        </w:rPr>
+        <w:t>Mlimani</w:t>
+      </w:r>
+      <w:proofErr w:type="spellEnd"/>
+      <w:r>
+        <w:rPr>
+          <w:rFonts w:ascii="Times New Roman" w:hAnsi="Times New Roman" w:cs="Times New Roman"/>
+          <w:color w:val="333333"/>
+        </w:rPr>
+        <w:t xml:space="preserve"> Main Campus boundaries. The college maps out as a dedicated multi-block engineering campus quadrant on the western side of the campus grounds, easily reached by executing a right-turn vector immediately following the main university perimeter entrance gate.</w:t>
       </w:r>
     </w:p>
     <w:p>
@@ -1970,7 +2158,25 @@
           <w:b/>
           <w:color w:val="000000"/>
         </w:rPr>
-        <w:t>Where are the Mabibo Hostels located?</w:t>
+        <w:t xml:space="preserve">Where are the </w:t>
+      </w:r>
+      <w:proofErr w:type="spellStart"/>
+      <w:r>
+        <w:rPr>
+          <w:rFonts w:ascii="Times New Roman" w:hAnsi="Times New Roman" w:cs="Times New Roman"/>
+          <w:b/>
+          <w:color w:val="000000"/>
+        </w:rPr>
+        <w:t>Mabibo</w:t>
+      </w:r>
+      <w:proofErr w:type="spellEnd"/>
+      <w:r>
+        <w:rPr>
+          <w:rFonts w:ascii="Times New Roman" w:hAnsi="Times New Roman" w:cs="Times New Roman"/>
+          <w:b/>
+          <w:color w:val="000000"/>
+        </w:rPr>
+        <w:t xml:space="preserve"> Hostels located?</w:t>
       </w:r>
     </w:p>
     <w:p>
@@ -1993,7 +2199,71 @@
           <w:rFonts w:ascii="Times New Roman" w:hAnsi="Times New Roman" w:cs="Times New Roman"/>
           <w:color w:val="333333"/>
         </w:rPr>
-        <w:t>The Mabibo Hostels are located completely outside the core campus zone in the external Mabibo municipal sector, approximately 4 kilometers out. To support mobility, the university runs a continuous scheduled loop of dedicated student commuter shuttle buses departing from the Mabibo compound terminal straight to the Mlimani Main Campus drop points.</w:t>
+        <w:t xml:space="preserve">The </w:t>
+      </w:r>
+      <w:proofErr w:type="spellStart"/>
+      <w:r>
+        <w:rPr>
+          <w:rFonts w:ascii="Times New Roman" w:hAnsi="Times New Roman" w:cs="Times New Roman"/>
+          <w:color w:val="333333"/>
+        </w:rPr>
+        <w:t>Mabibo</w:t>
+      </w:r>
+      <w:proofErr w:type="spellEnd"/>
+      <w:r>
+        <w:rPr>
+          <w:rFonts w:ascii="Times New Roman" w:hAnsi="Times New Roman" w:cs="Times New Roman"/>
+          <w:color w:val="333333"/>
+        </w:rPr>
+        <w:t xml:space="preserve"> Hostels are located completely outside the core campus zone in the external </w:t>
+      </w:r>
+      <w:proofErr w:type="spellStart"/>
+      <w:r>
+        <w:rPr>
+          <w:rFonts w:ascii="Times New Roman" w:hAnsi="Times New Roman" w:cs="Times New Roman"/>
+          <w:color w:val="333333"/>
+        </w:rPr>
+        <w:t>Mabibo</w:t>
+      </w:r>
+      <w:proofErr w:type="spellEnd"/>
+      <w:r>
+        <w:rPr>
+          <w:rFonts w:ascii="Times New Roman" w:hAnsi="Times New Roman" w:cs="Times New Roman"/>
+          <w:color w:val="333333"/>
+        </w:rPr>
+        <w:t xml:space="preserve"> municipal sector, approximately 4 kilometers out. To support mobility, the university runs a continuous scheduled loop of dedicated student commuter shuttle buses departing from the </w:t>
+      </w:r>
+      <w:proofErr w:type="spellStart"/>
+      <w:r>
+        <w:rPr>
+          <w:rFonts w:ascii="Times New Roman" w:hAnsi="Times New Roman" w:cs="Times New Roman"/>
+          <w:color w:val="333333"/>
+        </w:rPr>
+        <w:t>Mabibo</w:t>
+      </w:r>
+      <w:proofErr w:type="spellEnd"/>
+      <w:r>
+        <w:rPr>
+          <w:rFonts w:ascii="Times New Roman" w:hAnsi="Times New Roman" w:cs="Times New Roman"/>
+          <w:color w:val="333333"/>
+        </w:rPr>
+        <w:t xml:space="preserve"> compound terminal straight to the </w:t>
+      </w:r>
+      <w:proofErr w:type="spellStart"/>
+      <w:r>
+        <w:rPr>
+          <w:rFonts w:ascii="Times New Roman" w:hAnsi="Times New Roman" w:cs="Times New Roman"/>
+          <w:color w:val="333333"/>
+        </w:rPr>
+        <w:t>Mlimani</w:t>
+      </w:r>
+      <w:proofErr w:type="spellEnd"/>
+      <w:r>
+        <w:rPr>
+          <w:rFonts w:ascii="Times New Roman" w:hAnsi="Times New Roman" w:cs="Times New Roman"/>
+          <w:color w:val="333333"/>
+        </w:rPr>
+        <w:t xml:space="preserve"> Main Campus drop points.</w:t>
       </w:r>
     </w:p>
     <w:p>
@@ -2101,7 +2371,25 @@
           <w:rFonts w:ascii="Times New Roman" w:hAnsi="Times New Roman" w:cs="Times New Roman"/>
           <w:color w:val="333333"/>
         </w:rPr>
-        <w:t>The formal operational window for elective course allocation and document validation systematically shuts down precisely 14 calendar days (two weeks) after the official opening bell of the semester. Late execution requests demand a signed endorsement from your college Principal or academic Dean and routinely draw a explicit financial penalty fee.</w:t>
+        <w:t xml:space="preserve">The formal operational window for elective course allocation and document validation systematically shuts down precisely 14 calendar days (two weeks) after the official opening bell of the semester. Late execution requests demand a signed endorsement from your college Principal or academic Dean and routinely draw </w:t>
+      </w:r>
+      <w:proofErr w:type="spellStart"/>
+      <w:proofErr w:type="gramStart"/>
+      <w:r>
+        <w:rPr>
+          <w:rFonts w:ascii="Times New Roman" w:hAnsi="Times New Roman" w:cs="Times New Roman"/>
+          <w:color w:val="333333"/>
+        </w:rPr>
+        <w:t>a</w:t>
+      </w:r>
+      <w:proofErr w:type="spellEnd"/>
+      <w:proofErr w:type="gramEnd"/>
+      <w:r>
+        <w:rPr>
+          <w:rFonts w:ascii="Times New Roman" w:hAnsi="Times New Roman" w:cs="Times New Roman"/>
+          <w:color w:val="333333"/>
+        </w:rPr>
+        <w:t xml:space="preserve"> explicit financial penalty fee.</w:t>
       </w:r>
     </w:p>
     <w:p>
@@ -2300,7 +2588,25 @@
           <w:rFonts w:ascii="Times New Roman" w:hAnsi="Times New Roman" w:cs="Times New Roman"/>
           <w:color w:val="333333"/>
         </w:rPr>
-        <w:t>Failing an individual module (earning a aggregate mark below the mandatory undergraduate pass baseline of 40%) demands that the student sit for a Supplementary Examination ('Supp'). These are specialized assessment pipelines scheduled explicitly during the long academic recess period before the next school year begins.</w:t>
+        <w:t xml:space="preserve">Failing an individual module (earning </w:t>
+      </w:r>
+      <w:proofErr w:type="spellStart"/>
+      <w:proofErr w:type="gramStart"/>
+      <w:r>
+        <w:rPr>
+          <w:rFonts w:ascii="Times New Roman" w:hAnsi="Times New Roman" w:cs="Times New Roman"/>
+          <w:color w:val="333333"/>
+        </w:rPr>
+        <w:t>a</w:t>
+      </w:r>
+      <w:proofErr w:type="spellEnd"/>
+      <w:proofErr w:type="gramEnd"/>
+      <w:r>
+        <w:rPr>
+          <w:rFonts w:ascii="Times New Roman" w:hAnsi="Times New Roman" w:cs="Times New Roman"/>
+          <w:color w:val="333333"/>
+        </w:rPr>
+        <w:t xml:space="preserve"> aggregate mark below the mandatory undergraduate pass baseline of 40%) demands that the student sit for a Supplementary Examination ('Supp'). These are specialized assessment pipelines scheduled explicitly during the long academic recess period before the next school year begins.</w:t>
       </w:r>
     </w:p>
     <w:p>
@@ -2448,12 +2754,14 @@
         </w:rPr>
         <w:t xml:space="preserve">My </w:t>
       </w:r>
+      <w:proofErr w:type="spellStart"/>
       <w:r>
         <w:rPr>
           <w:rFonts w:ascii="Times New Roman" w:hAnsi="Times New Roman" w:cs="Times New Roman"/>
         </w:rPr>
         <w:t>Courese&amp;Results</w:t>
       </w:r>
+      <w:proofErr w:type="spellEnd"/>
       <w:r>
         <w:rPr>
           <w:rFonts w:ascii="Times New Roman" w:hAnsi="Times New Roman" w:cs="Times New Roman"/>

</xml_diff>